<commit_message>
Suma guías de composición y prompts para explorar los pasteles
Analiza el estilo de nueve pasteles de referencia y deriva una paleta
matérica: cada color se nombra por el material de la novela y sus
propiedades físicas, con página. Escribe seis prompts para GPT Image 2,
con variante, qué evitar y qué mirar, en analisis/17. Genera seis guías
de composición sin texto (1536 x 1024 o 1024 x 1536) y una máscara
opcional para la Figura 5, con su script. Corrige el esquema de la
Figura 2: el Signo Escalonado ya no es una pirámide simétrica y no
encaja en la pendiente, como dice el texto. Anota en LEEME y en 04 qué
cambia en el artículo cuando entren los escaneos.

Co-Authored-By: Claude Opus 5.5 <noreply@anthropic.com>
Claude-Session: https://claude.ai/code/session_01QWC9b4jcZbzQ8czhYUvPYd
</commit_message>
<xml_diff>
--- a/articulo/articulo_cosecha_de_piedras_cambios.docx
+++ b/articulo/articulo_cosecha_de_piedras_cambios.docx
@@ -350,7 +350,7 @@
         <w:rPr/>
         <w:t xml:space="preserve">El narrador, además, no es inocente. La novela se publicó en Buenos Aires en 1945 y se cita aquí por una reedición paceña de 1982, cuya nota editorial asegura que el autor «ama al indio», que enseñó en la Escuela Indigenal de Warisata y que Jatun-Kolla «es, en realidad, Warisata» (Botelho Gosálvez, 1982 [1945]: 5). </w:t>
       </w:r>
-      <w:del w:id="0" w:author="Unknown Author" w:date="2026-09-29T17:12:01Z">
+      <w:del w:id="0" w:author="Unknown Author" w:date="2026-09-30T18:30:03Z">
         <w:r>
           <w:rPr/>
           <w:delText xml:space="preserve">Aquí no se lee la novela ni como documento ni como redención. </w:delText>
@@ -543,13 +543,13 @@
         <w:rPr/>
         <w:t xml:space="preserve"> a lo que hacen las manos cuando piensan, expresan o comunican: un «neologismo homólogo al lenguaje, pero con las manos» (Cárcamo Pino, 2019: 1412, cit. en Cárcamo Pino, 2025b: 244). Escribir es una de esas acciones</w:t>
       </w:r>
-      <w:del w:id="1" w:author="Unknown Author" w:date="2026-09-29T17:12:01Z">
+      <w:del w:id="1" w:author="Unknown Author" w:date="2026-09-30T18:30:03Z">
         <w:r>
           <w:rPr/>
           <w:delText xml:space="preserve">, y cada oficio tiene su </w:delText>
         </w:r>
       </w:del>
-      <w:del w:id="2" w:author="Unknown Author" w:date="2026-09-29T17:12:01Z">
+      <w:del w:id="2" w:author="Unknown Author" w:date="2026-09-30T18:30:03Z">
         <w:r>
           <w:rPr>
             <w:i/>
@@ -558,7 +558,7 @@
           <w:delText>manoaje</w:delText>
         </w:r>
       </w:del>
-      <w:del w:id="3" w:author="Unknown Author" w:date="2026-09-29T17:12:01Z">
+      <w:del w:id="3" w:author="Unknown Author" w:date="2026-09-30T18:30:03Z">
         <w:r>
           <w:rPr/>
           <w:delText>, «un subgrupo contextual de acciones manuales» (Cárcamo Pino, 2025b: 259)</w:delText>
@@ -1837,13 +1837,13 @@
         <w:rPr/>
         <w:t xml:space="preserve">La chujlla de los Huanca tiene dos metros de alto, paredes «renegridas por el hollín» y camastros de «apenas la altura de un adobe»; de las vigas, «mal unidas con lazos de paja trenzada», cuelgan «las hoces, el arado, el yugo de madera» (ibid.: 30-31). Junta las dos maneras de construir de Frampton: muros de piedra y adobe que pesan, y un armazón atado como una cestería (Frampton, 1995: 5). Se mide con el cuerpo y </w:t>
       </w:r>
-      <w:ins w:id="4" w:author="Unknown Author" w:date="2026-09-29T17:12:01Z">
+      <w:ins w:id="4" w:author="Unknown Author" w:date="2026-09-30T18:30:03Z">
         <w:r>
           <w:rPr/>
           <w:t xml:space="preserve">es </w:t>
         </w:r>
       </w:ins>
-      <w:del w:id="5" w:author="Unknown Author" w:date="2026-09-29T17:12:01Z">
+      <w:del w:id="5" w:author="Unknown Author" w:date="2026-09-30T18:30:03Z">
         <w:r>
           <w:rPr/>
           <w:delText xml:space="preserve">guarda las herramientas de las manos. Es </w:delText>
@@ -1853,7 +1853,7 @@
         <w:rPr/>
         <w:t>una caja de herramientas, que para Cárcamo Pino es a las manos lo que un idioma a la lengua (Cárcamo Pino, 2025a: 12). El narrador, en cambio, entra como un intruso que no habita, sino que escribe: los camastros son «morada de piojos y pulgas» (Botelho Gosálvez, 1982 [1945]: 31). Pallasmaa recuerda que «la casa es una metáfora del cuerpo y el cuerpo una metáfora de la casa» (Pallasmaa, 2014: 159); el narrador hace de la chujlla una madriguera</w:t>
       </w:r>
-      <w:del w:id="6" w:author="Unknown Author" w:date="2026-09-29T17:12:01Z">
+      <w:del w:id="6" w:author="Unknown Author" w:date="2026-09-30T18:30:03Z">
         <w:r>
           <w:rPr/>
           <w:delText>. Su umbral es el «portal de su chujlla» desde el que Paulo Huanca ve partir a los hijos que la escasez expulsa (Botelho Gosálvez, 1982 [1945]: 34)</w:delText>
@@ -1907,13 +1907,13 @@
         <w:rPr/>
         <w:t>. Muros de piedra de dos metros de alto, fuego al centro, herramientas colgadas de las vigas (</w:t>
       </w:r>
-      <w:moveTo w:id="7" w:author="Unknown Author" w:date="2026-09-29T17:12:01Z">
+      <w:moveTo w:id="7" w:author="Unknown Author" w:date="2026-09-30T18:30:03Z">
         <w:r>
           <w:rPr/>
           <w:t>Botelho Gosálvez, 1982 [1945]</w:t>
         </w:r>
       </w:moveTo>
-      <w:del w:id="8" w:author="Unknown Author" w:date="2026-09-29T17:12:01Z">
+      <w:del w:id="8" w:author="Unknown Author" w:date="2026-09-30T18:30:03Z">
         <w:r>
           <w:rPr/>
           <w:delText>ibid.</w:delText>
@@ -2296,7 +2296,7 @@
         <w:rPr/>
         <w:t>El éxodo a los Yungas empieza en un umbral: «Tras de la muralla que condena el horizonte del altiplano empieza el yunga» (Botelho Gosálvez, 1982 [1945]: 108). El valle, que en el archipiélago de Zavaleta sería otro piso de la misma tierra, es para los jóvenes del ayllu una «fábula» (ibid.: 7), y del otro lado espera la finca. En la apacheta, el viento sacude el poncho de Paulo Huanca «como un gallardete clavado en la ceja de la apacheta», su familia reza de rodillas y las cumbres se alzan «semejantes a fantásticas construcciones góticas» (ibid.: 109).</w:t>
       </w:r>
-      <w:del w:id="9" w:author="Unknown Author" w:date="2026-09-29T17:12:01Z">
+      <w:del w:id="9" w:author="Unknown Author" w:date="2026-09-30T18:30:03Z">
         <w:r>
           <w:rPr/>
           <w:delText xml:space="preserve"> El narrador ve en la cordillera la arquitectura de Europa.</w:delText>
@@ -2400,7 +2400,7 @@
         <w:rPr/>
         <w:t xml:space="preserve"> al «montón de piedras, que por superstición van haciendo los caminantes y los adoran» (Bertonio, 2011 [1612]: 317), en el que se pegaba «coca mascada con las manos» (ibid.: 349): un montón que crece con cada viajero</w:t>
       </w:r>
-      <w:del w:id="10" w:author="Unknown Author" w:date="2026-09-29T17:12:01Z">
+      <w:del w:id="10" w:author="Unknown Author" w:date="2026-09-30T18:30:03Z">
         <w:r>
           <w:rPr/>
           <w:delText>, obra de muchas manos</w:delText>
@@ -2687,13 +2687,13 @@
         <w:rPr/>
         <w:t>El yatiri Basilio Quispe</w:t>
       </w:r>
-      <w:ins w:id="11" w:author="Unknown Author" w:date="2026-09-29T17:12:01Z">
+      <w:ins w:id="11" w:author="Unknown Author" w:date="2026-09-30T18:30:03Z">
         <w:r>
           <w:rPr/>
           <w:t xml:space="preserve">, que vendía «piedra bezoar» (Botelho Gosálvez, 1982 [1945]: 66), </w:t>
         </w:r>
       </w:ins>
-      <w:del w:id="12" w:author="Unknown Author" w:date="2026-09-29T17:12:01Z">
+      <w:del w:id="12" w:author="Unknown Author" w:date="2026-09-30T18:30:03Z">
         <w:r>
           <w:rPr/>
           <w:delText xml:space="preserve"> </w:delText>
@@ -2703,13 +2703,13 @@
         <w:rPr/>
         <w:t>es acusado de causar la sequía: de sus ropas caen «dos muñequitos de lana» atravesados por una espina (</w:t>
       </w:r>
-      <w:ins w:id="13" w:author="Unknown Author" w:date="2026-09-29T17:12:01Z">
+      <w:ins w:id="13" w:author="Unknown Author" w:date="2026-09-30T18:30:03Z">
         <w:r>
           <w:rPr/>
           <w:t>ibid.</w:t>
         </w:r>
       </w:ins>
-      <w:moveFrom w:id="14" w:author="Unknown Author" w:date="2026-09-29T17:12:01Z">
+      <w:moveFrom w:id="14" w:author="Unknown Author" w:date="2026-09-30T18:30:03Z">
         <w:r>
           <w:rPr/>
           <w:t>Botelho Gosálvez, 1982 [1945]</w:t>
@@ -2818,7 +2818,7 @@
         <w:rPr/>
         <w:t xml:space="preserve"> era «nombre de reverencia», y se le decía «yo seré tu hijo» (Bertonio, 2011 [1612]: 420)</w:t>
       </w:r>
-      <w:del w:id="15" w:author="Unknown Author" w:date="2026-09-29T17:12:01Z">
+      <w:del w:id="15" w:author="Unknown Author" w:date="2026-09-30T18:30:03Z">
         <w:r>
           <w:rPr/>
           <w:delText>; las montañas, en cambio, suelen ser masculinas (Dean, 2010: 68), como el cerro «padre del ayllu» (Botelho Gosálvez, 1982 [1945]: 8)</w:delText>
@@ -2828,13 +2828,13 @@
         <w:rPr/>
         <w:t>. Lo que sí es del narrador es el tono: una tierra que «abortó en plena gestación» (</w:t>
       </w:r>
-      <w:moveTo w:id="16" w:author="Unknown Author" w:date="2026-09-29T17:12:01Z">
+      <w:moveTo w:id="16" w:author="Unknown Author" w:date="2026-09-30T18:30:03Z">
         <w:r>
           <w:rPr/>
           <w:t>Botelho Gosálvez, 1982 [1945]</w:t>
         </w:r>
       </w:moveTo>
-      <w:del w:id="17" w:author="Unknown Author" w:date="2026-09-29T17:12:01Z">
+      <w:del w:id="17" w:author="Unknown Author" w:date="2026-09-30T18:30:03Z">
         <w:r>
           <w:rPr/>
           <w:delText>ibid.</w:delText>
@@ -3113,7 +3113,7 @@
         <w:rPr/>
         <w:t>Con las heladas vuelven los sobrevivientes: «en el dintel de Jatun-Kolla se detenían para ponerse de rodillas y besar el suelo</w:t>
       </w:r>
-      <w:ins w:id="18" w:author="Unknown Author" w:date="2026-09-29T17:12:01Z">
+      <w:ins w:id="18" w:author="Unknown Author" w:date="2026-09-30T18:30:03Z">
         <w:r>
           <w:rPr/>
           <w:t xml:space="preserve"> que habían abandonado en el terror</w:t>
@@ -3186,13 +3186,13 @@
         <w:rPr/>
         <w:t>Muralla, foso, atalaya: recordar es construir, y olvidar también. Es lo contrario del lema del epígrafe: los comunarios de la novela no caminan mirando al pasado; lo esconden en un foso. La selección tiene nombres: «Llegaron los Villca, los Huanca, los Huallpa, los Yupanqui, los Ticona, los Choque, los Chuquihuanca» (ibid.: 156). Faltan los Condori, los Mamani y los Quispe, la «legión» sin tierra que cerraba la escalera del narrador (ibid.: 22). Juan Condori está enterrado en el cementerio de los mineros; los miembros de Basilio Quispe, «en muchos sitios» (ibid.: 69). El Signo Escalonado se rehace sin su último escalón. Una pirca de doble cara enseña lo que esa memoria olvida: las piedras grandes dan la cara, pero adentro, apretadas entre las dos caras, van las menudas, y sin ese relleno el muro se cae. El narrador también llama «legión» a la «piedrecilla menuda» que baja del cerro hasta las pircas (ibid.: 8). Los sin tierra fueron ese relleno: tres de ellos, sin nombre, cuidaron el ayllu vacío, y el retorno no los cuenta. Con la cosecha, los derrotados «olvidaron la pesadilla pasada»</w:t>
       </w:r>
-      <w:ins w:id="19" w:author="Unknown Author" w:date="2026-09-29T17:12:01Z">
+      <w:ins w:id="19" w:author="Unknown Author" w:date="2026-09-30T18:30:03Z">
         <w:r>
           <w:rPr/>
           <w:t xml:space="preserve"> </w:t>
         </w:r>
       </w:ins>
-      <w:del w:id="20" w:author="Unknown Author" w:date="2026-09-29T17:12:01Z">
+      <w:del w:id="20" w:author="Unknown Author" w:date="2026-09-30T18:30:03Z">
         <w:r>
           <w:rPr/>
           <w:delText xml:space="preserve">, y la Pachamama recuperó «su prestigio de hembra paridora y múltiple» </w:delText>
@@ -3213,7 +3213,7 @@
         <w:rPr/>
         <w:t xml:space="preserve">, «corazón de piedra»; </w:t>
       </w:r>
-      <w:ins w:id="21" w:author="Unknown Author" w:date="2026-09-29T17:12:01Z">
+      <w:ins w:id="21" w:author="Unknown Author" w:date="2026-09-30T18:30:03Z">
         <w:r>
           <w:rPr/>
           <w:t xml:space="preserve">en un relato de Spedding, </w:t>
@@ -3223,7 +3223,7 @@
         <w:rPr/>
         <w:t>para volverse así</w:t>
       </w:r>
-      <w:del w:id="22" w:author="Unknown Author" w:date="2026-09-29T17:12:01Z">
+      <w:del w:id="22" w:author="Unknown Author" w:date="2026-09-30T18:30:03Z">
         <w:r>
           <w:rPr/>
           <w:delText>,</w:delText>
@@ -3233,13 +3233,13 @@
         <w:rPr/>
         <w:t xml:space="preserve"> «hay que lamer el batán de moler» (Spedding, 2025: XV)</w:t>
       </w:r>
-      <w:ins w:id="23" w:author="Unknown Author" w:date="2026-09-29T17:12:01Z">
+      <w:ins w:id="23" w:author="Unknown Author" w:date="2026-09-30T18:30:03Z">
         <w:r>
           <w:rPr/>
           <w:t xml:space="preserve">. Contra el susto, la piedra se usa al revés: se come el bezoar del yatiri, en aymara </w:t>
         </w:r>
       </w:ins>
-      <w:ins w:id="24" w:author="Unknown Author" w:date="2026-09-29T17:12:01Z">
+      <w:ins w:id="24" w:author="Unknown Author" w:date="2026-09-30T18:30:03Z">
         <w:r>
           <w:rPr>
             <w:i/>
@@ -3248,7 +3248,7 @@
           <w:t>jayintilla</w:t>
         </w:r>
       </w:ins>
-      <w:ins w:id="25" w:author="Unknown Author" w:date="2026-09-29T17:12:01Z">
+      <w:ins w:id="25" w:author="Unknown Author" w:date="2026-09-30T18:30:03Z">
         <w:r>
           <w:rPr/>
           <w:t xml:space="preserve"> (Bertonio, 2011 [1612]: 361), o la tierra del lugar del miedo, para «retornar al territorio y a la memoria» (Rodríguez y Rodríguez, 2025: 55). Los comunarios besan el suelo, pero no vuelven a la memoria</w:t>
@@ -3848,16 +3848,16 @@
       <w:pPr>
         <w:pStyle w:val="BodyText"/>
         <w:rPr>
-          <w:ins w:id="29" w:author="Unknown Author" w:date="2026-09-29T17:12:01Z"/>
-        </w:rPr>
-      </w:pPr>
-      <w:ins w:id="26" w:author="Unknown Author" w:date="2026-09-29T17:12:01Z">
+          <w:ins w:id="29" w:author="Unknown Author" w:date="2026-09-30T18:30:03Z"/>
+        </w:rPr>
+      </w:pPr>
+      <w:ins w:id="26" w:author="Unknown Author" w:date="2026-09-30T18:30:03Z">
         <w:r>
           <w:rPr/>
           <w:t xml:space="preserve">Rodríguez, Malena y Rodríguez, Gabriel (2025). “Susto andino y violencia política”. En Eloísa Paz y alfonso borragán (dirs.), </w:t>
         </w:r>
       </w:ins>
-      <w:ins w:id="27" w:author="Unknown Author" w:date="2026-09-29T17:12:01Z">
+      <w:ins w:id="27" w:author="Unknown Author" w:date="2026-09-30T18:30:03Z">
         <w:r>
           <w:rPr>
             <w:i/>
@@ -3866,7 +3866,7 @@
           <w:t>Susto al susto</w:t>
         </w:r>
       </w:ins>
-      <w:ins w:id="28" w:author="Unknown Author" w:date="2026-09-29T17:12:01Z">
+      <w:ins w:id="28" w:author="Unknown Author" w:date="2026-09-30T18:30:03Z">
         <w:r>
           <w:rPr/>
           <w:t>. La Paz: A ediciones: 43-61.</w:t>
@@ -3924,7 +3924,7 @@
         <w:rPr/>
         <w:t xml:space="preserve">Spedding, Alison (2025). “Piedras en el camino”. En </w:t>
       </w:r>
-      <w:ins w:id="30" w:author="Unknown Author" w:date="2026-09-29T17:12:01Z">
+      <w:ins w:id="30" w:author="Unknown Author" w:date="2026-09-30T18:30:03Z">
         <w:r>
           <w:rPr/>
           <w:t xml:space="preserve">Eloísa Paz y alfonso borragán (dirs.), </w:t>

</xml_diff>